<commit_message>
update resume and site configuration
</commit_message>
<xml_diff>
--- a/public/Chris-Thackrey-Resume.docx
+++ b/public/Chris-Thackrey-Resume.docx
@@ -1701,7 +1701,6 @@
           <w:sz w:val="20"/>
           <w:szCs w:val="20"/>
         </w:rPr>
-        <w:lastRenderedPageBreak/>
         <w:t>SOFTWARE ENGINEER</w:t>
       </w:r>
       <w:r>
@@ -1787,6 +1786,7 @@
           <w:sz w:val="20"/>
           <w:szCs w:val="20"/>
         </w:rPr>
+        <w:lastRenderedPageBreak/>
         <w:t>Black Flag Design</w:t>
       </w:r>
       <w:r>
@@ -3579,12 +3579,8 @@
       </w:r>
     </w:p>
     <w:sectPr>
-      <w:headerReference w:type="even" r:id="rId15"/>
-      <w:headerReference w:type="default" r:id="rId16"/>
-      <w:footerReference w:type="even" r:id="rId17"/>
-      <w:footerReference w:type="default" r:id="rId18"/>
-      <w:headerReference w:type="first" r:id="rId19"/>
-      <w:footerReference w:type="first" r:id="rId20"/>
+      <w:headerReference w:type="default" r:id="rId15"/>
+      <w:footerReference w:type="first" r:id="rId16"/>
       <w:pgSz w:w="12240" w:h="15840"/>
       <w:pgMar w:top="504" w:right="662" w:bottom="173" w:left="720" w:header="432" w:footer="432" w:gutter="0"/>
       <w:cols w:space="720"/>
@@ -3625,26 +3621,6 @@
   <w:p>
     <w:pPr>
       <w:pStyle w:val="Footer"/>
-    </w:pPr>
-  </w:p>
-</w:ftr>
-</file>
-
-<file path=word/footer2.xml><?xml version="1.0" encoding="utf-8"?>
-<w:ftr xmlns:wpc="http://schemas.microsoft.com/office/word/2010/wordprocessingCanvas" xmlns:cx="http://schemas.microsoft.com/office/drawing/2014/chartex" xmlns:cx1="http://schemas.microsoft.com/office/drawing/2015/9/8/chartex" xmlns:cx2="http://schemas.microsoft.com/office/drawing/2015/10/21/chartex" xmlns:cx3="http://schemas.microsoft.com/office/drawing/2016/5/9/chartex" xmlns:cx4="http://schemas.microsoft.com/office/drawing/2016/5/10/chartex" xmlns:cx5="http://schemas.microsoft.com/office/drawing/2016/5/11/chartex" xmlns:cx6="http://schemas.microsoft.com/office/drawing/2016/5/12/chartex" xmlns:cx7="http://schemas.microsoft.com/office/drawing/2016/5/13/chartex" xmlns:cx8="http://schemas.microsoft.com/office/drawing/2016/5/14/chartex" xmlns:mc="http://schemas.openxmlformats.org/markup-compatibility/2006" xmlns:m="http://schemas.openxmlformats.org/officeDocument/2006/math" xmlns:aink="http://schemas.microsoft.com/office/drawing/2016/ink" xmlns:am3d="http://schemas.microsoft.com/office/drawing/2017/model3d" xmlns:oel="http://schemas.microsoft.com/office/2019/extlst" xmlns:r="http://schemas.openxmlformats.org/officeDocument/2006/relationships" xmlns:wp14="http://schemas.microsoft.com/office/word/2010/wordprocessingDrawing" xmlns:wp="http://schemas.openxmlformats.org/drawingml/2006/wordprocessingDrawing" xmlns:wpg="http://schemas.microsoft.com/office/word/2010/wordprocessingGroup" xmlns:wpi="http://schemas.microsoft.com/office/word/2010/wordprocessingInk" xmlns:wps="http://schemas.microsoft.com/office/word/2010/wordprocessingShape" xmlns:o="urn:schemas-microsoft-com:office:office" xmlns:v="urn:schemas-microsoft-com:vml" xmlns:w10="urn:schemas-microsoft-com:office:word" xmlns:w="http://schemas.openxmlformats.org/wordprocessingml/2006/main" xmlns:w14="http://schemas.microsoft.com/office/word/2010/wordml" xmlns:w15="http://schemas.microsoft.com/office/word/2012/wordml" xmlns:w16cex="http://schemas.microsoft.com/office/word/2018/wordml/cex" xmlns:w16cid="http://schemas.microsoft.com/office/word/2016/wordml/cid" xmlns:w16="http://schemas.microsoft.com/office/word/2018/wordml" xmlns:w16sdtdh="http://schemas.microsoft.com/office/word/2020/wordml/sdtdatahash" xmlns:w16sdtfl="http://schemas.microsoft.com/office/word/2024/wordml/sdtformatlock" xmlns:w16se="http://schemas.microsoft.com/office/word/2015/wordml/symex" xmlns:w16du="http://schemas.microsoft.com/office/word/2023/wordml/word16du" xmlns:wne="http://schemas.microsoft.com/office/word/2006/wordml" mc:Ignorable="w14 w15 w16se w16cid w16 w16cex w16sdtdh w16sdtfl w16du wp14">
-  <w:p>
-    <w:pPr>
-      <w:pStyle w:val="Footer"/>
-    </w:pPr>
-  </w:p>
-</w:ftr>
-</file>
-
-<file path=word/footer3.xml><?xml version="1.0" encoding="utf-8"?>
-<w:ftr xmlns:wpc="http://schemas.microsoft.com/office/word/2010/wordprocessingCanvas" xmlns:cx="http://schemas.microsoft.com/office/drawing/2014/chartex" xmlns:cx1="http://schemas.microsoft.com/office/drawing/2015/9/8/chartex" xmlns:cx2="http://schemas.microsoft.com/office/drawing/2015/10/21/chartex" xmlns:cx3="http://schemas.microsoft.com/office/drawing/2016/5/9/chartex" xmlns:cx4="http://schemas.microsoft.com/office/drawing/2016/5/10/chartex" xmlns:cx5="http://schemas.microsoft.com/office/drawing/2016/5/11/chartex" xmlns:cx6="http://schemas.microsoft.com/office/drawing/2016/5/12/chartex" xmlns:cx7="http://schemas.microsoft.com/office/drawing/2016/5/13/chartex" xmlns:cx8="http://schemas.microsoft.com/office/drawing/2016/5/14/chartex" xmlns:mc="http://schemas.openxmlformats.org/markup-compatibility/2006" xmlns:m="http://schemas.openxmlformats.org/officeDocument/2006/math" xmlns:aink="http://schemas.microsoft.com/office/drawing/2016/ink" xmlns:am3d="http://schemas.microsoft.com/office/drawing/2017/model3d" xmlns:oel="http://schemas.microsoft.com/office/2019/extlst" xmlns:r="http://schemas.openxmlformats.org/officeDocument/2006/relationships" xmlns:wp14="http://schemas.microsoft.com/office/word/2010/wordprocessingDrawing" xmlns:wp="http://schemas.openxmlformats.org/drawingml/2006/wordprocessingDrawing" xmlns:wpg="http://schemas.microsoft.com/office/word/2010/wordprocessingGroup" xmlns:wpi="http://schemas.microsoft.com/office/word/2010/wordprocessingInk" xmlns:wps="http://schemas.microsoft.com/office/word/2010/wordprocessingShape" xmlns:o="urn:schemas-microsoft-com:office:office" xmlns:v="urn:schemas-microsoft-com:vml" xmlns:w10="urn:schemas-microsoft-com:office:word" xmlns:w="http://schemas.openxmlformats.org/wordprocessingml/2006/main" xmlns:w14="http://schemas.microsoft.com/office/word/2010/wordml" xmlns:w15="http://schemas.microsoft.com/office/word/2012/wordml" xmlns:w16cex="http://schemas.microsoft.com/office/word/2018/wordml/cex" xmlns:w16cid="http://schemas.microsoft.com/office/word/2016/wordml/cid" xmlns:w16="http://schemas.microsoft.com/office/word/2018/wordml" xmlns:w16sdtdh="http://schemas.microsoft.com/office/word/2020/wordml/sdtdatahash" xmlns:w16sdtfl="http://schemas.microsoft.com/office/word/2024/wordml/sdtformatlock" xmlns:w16se="http://schemas.microsoft.com/office/word/2015/wordml/symex" xmlns:w16du="http://schemas.microsoft.com/office/word/2023/wordml/word16du" xmlns:wne="http://schemas.microsoft.com/office/word/2006/wordml" mc:Ignorable="w14 w15 w16se w16cid w16 w16cex w16sdtdh w16sdtfl w16du wp14">
-  <w:p>
-    <w:pPr>
-      <w:pStyle w:val="Footer"/>
       <w:jc w:val="right"/>
       <w:rPr>
         <w:i/>
@@ -3695,16 +3671,6 @@
 <w:hdr xmlns:wpc="http://schemas.microsoft.com/office/word/2010/wordprocessingCanvas" xmlns:cx="http://schemas.microsoft.com/office/drawing/2014/chartex" xmlns:cx1="http://schemas.microsoft.com/office/drawing/2015/9/8/chartex" xmlns:cx2="http://schemas.microsoft.com/office/drawing/2015/10/21/chartex" xmlns:cx3="http://schemas.microsoft.com/office/drawing/2016/5/9/chartex" xmlns:cx4="http://schemas.microsoft.com/office/drawing/2016/5/10/chartex" xmlns:cx5="http://schemas.microsoft.com/office/drawing/2016/5/11/chartex" xmlns:cx6="http://schemas.microsoft.com/office/drawing/2016/5/12/chartex" xmlns:cx7="http://schemas.microsoft.com/office/drawing/2016/5/13/chartex" xmlns:cx8="http://schemas.microsoft.com/office/drawing/2016/5/14/chartex" xmlns:mc="http://schemas.openxmlformats.org/markup-compatibility/2006" xmlns:m="http://schemas.openxmlformats.org/officeDocument/2006/math" xmlns:aink="http://schemas.microsoft.com/office/drawing/2016/ink" xmlns:am3d="http://schemas.microsoft.com/office/drawing/2017/model3d" xmlns:oel="http://schemas.microsoft.com/office/2019/extlst" xmlns:r="http://schemas.openxmlformats.org/officeDocument/2006/relationships" xmlns:wp14="http://schemas.microsoft.com/office/word/2010/wordprocessingDrawing" xmlns:wp="http://schemas.openxmlformats.org/drawingml/2006/wordprocessingDrawing" xmlns:wpg="http://schemas.microsoft.com/office/word/2010/wordprocessingGroup" xmlns:wpi="http://schemas.microsoft.com/office/word/2010/wordprocessingInk" xmlns:wps="http://schemas.microsoft.com/office/word/2010/wordprocessingShape" xmlns:o="urn:schemas-microsoft-com:office:office" xmlns:v="urn:schemas-microsoft-com:vml" xmlns:w10="urn:schemas-microsoft-com:office:word" xmlns:w="http://schemas.openxmlformats.org/wordprocessingml/2006/main" xmlns:w14="http://schemas.microsoft.com/office/word/2010/wordml" xmlns:w15="http://schemas.microsoft.com/office/word/2012/wordml" xmlns:w16cex="http://schemas.microsoft.com/office/word/2018/wordml/cex" xmlns:w16cid="http://schemas.microsoft.com/office/word/2016/wordml/cid" xmlns:w16="http://schemas.microsoft.com/office/word/2018/wordml" xmlns:w16sdtdh="http://schemas.microsoft.com/office/word/2020/wordml/sdtdatahash" xmlns:w16sdtfl="http://schemas.microsoft.com/office/word/2024/wordml/sdtformatlock" xmlns:w16se="http://schemas.microsoft.com/office/word/2015/wordml/symex" xmlns:w16du="http://schemas.microsoft.com/office/word/2023/wordml/word16du" xmlns:wne="http://schemas.microsoft.com/office/word/2006/wordml" mc:Ignorable="w14 w15 w16se w16cid w16 w16cex w16sdtdh w16sdtfl w16du wp14">
   <w:p>
     <w:pPr>
-      <w:pStyle w:val="Header"/>
-    </w:pPr>
-  </w:p>
-</w:hdr>
-</file>
-
-<file path=word/header2.xml><?xml version="1.0" encoding="utf-8"?>
-<w:hdr xmlns:wpc="http://schemas.microsoft.com/office/word/2010/wordprocessingCanvas" xmlns:cx="http://schemas.microsoft.com/office/drawing/2014/chartex" xmlns:cx1="http://schemas.microsoft.com/office/drawing/2015/9/8/chartex" xmlns:cx2="http://schemas.microsoft.com/office/drawing/2015/10/21/chartex" xmlns:cx3="http://schemas.microsoft.com/office/drawing/2016/5/9/chartex" xmlns:cx4="http://schemas.microsoft.com/office/drawing/2016/5/10/chartex" xmlns:cx5="http://schemas.microsoft.com/office/drawing/2016/5/11/chartex" xmlns:cx6="http://schemas.microsoft.com/office/drawing/2016/5/12/chartex" xmlns:cx7="http://schemas.microsoft.com/office/drawing/2016/5/13/chartex" xmlns:cx8="http://schemas.microsoft.com/office/drawing/2016/5/14/chartex" xmlns:mc="http://schemas.openxmlformats.org/markup-compatibility/2006" xmlns:m="http://schemas.openxmlformats.org/officeDocument/2006/math" xmlns:aink="http://schemas.microsoft.com/office/drawing/2016/ink" xmlns:am3d="http://schemas.microsoft.com/office/drawing/2017/model3d" xmlns:oel="http://schemas.microsoft.com/office/2019/extlst" xmlns:r="http://schemas.openxmlformats.org/officeDocument/2006/relationships" xmlns:wp14="http://schemas.microsoft.com/office/word/2010/wordprocessingDrawing" xmlns:wp="http://schemas.openxmlformats.org/drawingml/2006/wordprocessingDrawing" xmlns:wpg="http://schemas.microsoft.com/office/word/2010/wordprocessingGroup" xmlns:wpi="http://schemas.microsoft.com/office/word/2010/wordprocessingInk" xmlns:wps="http://schemas.microsoft.com/office/word/2010/wordprocessingShape" xmlns:o="urn:schemas-microsoft-com:office:office" xmlns:v="urn:schemas-microsoft-com:vml" xmlns:w10="urn:schemas-microsoft-com:office:word" xmlns:w="http://schemas.openxmlformats.org/wordprocessingml/2006/main" xmlns:w14="http://schemas.microsoft.com/office/word/2010/wordml" xmlns:w15="http://schemas.microsoft.com/office/word/2012/wordml" xmlns:w16cex="http://schemas.microsoft.com/office/word/2018/wordml/cex" xmlns:w16cid="http://schemas.microsoft.com/office/word/2016/wordml/cid" xmlns:w16="http://schemas.microsoft.com/office/word/2018/wordml" xmlns:w16sdtdh="http://schemas.microsoft.com/office/word/2020/wordml/sdtdatahash" xmlns:w16sdtfl="http://schemas.microsoft.com/office/word/2024/wordml/sdtformatlock" xmlns:w16se="http://schemas.microsoft.com/office/word/2015/wordml/symex" xmlns:w16du="http://schemas.microsoft.com/office/word/2023/wordml/word16du" xmlns:wne="http://schemas.microsoft.com/office/word/2006/wordml" mc:Ignorable="w14 w15 w16se w16cid w16 w16cex w16sdtdh w16sdtfl w16du wp14">
-  <w:p>
-    <w:pPr>
       <w:pBdr>
         <w:bottom w:val="single" w:sz="12" w:space="1" w:color="002060"/>
       </w:pBdr>
@@ -3768,7 +3734,29 @@
         <w:color w:val="000000" w:themeColor="text1"/>
         <w:sz w:val="24"/>
       </w:rPr>
-      <w:tab/>
+      <w:t xml:space="preserve"> </w:t>
+    </w:r>
+    <w:r>
+      <w:rPr>
+        <w:sz w:val="24"/>
+      </w:rPr>
+      <w:t xml:space="preserve">| </w:t>
+    </w:r>
+    <w:hyperlink r:id="rId3" w:history="1">
+      <w:r>
+        <w:rPr>
+          <w:rStyle w:val="Hyperlink"/>
+          <w:b/>
+          <w:bCs/>
+          <w:color w:val="000000" w:themeColor="text1"/>
+          <w:sz w:val="24"/>
+          <w:u w:val="none"/>
+        </w:rPr>
+        <w:t>GitHub</w:t>
+      </w:r>
+    </w:hyperlink>
+    <w:r>
+      <w:t xml:space="preserve"> </w:t>
     </w:r>
     <w:r>
       <w:rPr>
@@ -3779,7 +3767,7 @@
       </w:rPr>
       <w:t xml:space="preserve">| </w:t>
     </w:r>
-    <w:hyperlink r:id="rId3" w:history="1">
+    <w:hyperlink r:id="rId4" w:history="1">
       <w:r>
         <w:rPr>
           <w:rStyle w:val="Hyperlink"/>
@@ -3811,16 +3799,6 @@
       <w:tab/>
       <w:t>Page 2</w:t>
     </w:r>
-  </w:p>
-</w:hdr>
-</file>
-
-<file path=word/header3.xml><?xml version="1.0" encoding="utf-8"?>
-<w:hdr xmlns:wpc="http://schemas.microsoft.com/office/word/2010/wordprocessingCanvas" xmlns:cx="http://schemas.microsoft.com/office/drawing/2014/chartex" xmlns:cx1="http://schemas.microsoft.com/office/drawing/2015/9/8/chartex" xmlns:cx2="http://schemas.microsoft.com/office/drawing/2015/10/21/chartex" xmlns:cx3="http://schemas.microsoft.com/office/drawing/2016/5/9/chartex" xmlns:cx4="http://schemas.microsoft.com/office/drawing/2016/5/10/chartex" xmlns:cx5="http://schemas.microsoft.com/office/drawing/2016/5/11/chartex" xmlns:cx6="http://schemas.microsoft.com/office/drawing/2016/5/12/chartex" xmlns:cx7="http://schemas.microsoft.com/office/drawing/2016/5/13/chartex" xmlns:cx8="http://schemas.microsoft.com/office/drawing/2016/5/14/chartex" xmlns:mc="http://schemas.openxmlformats.org/markup-compatibility/2006" xmlns:m="http://schemas.openxmlformats.org/officeDocument/2006/math" xmlns:aink="http://schemas.microsoft.com/office/drawing/2016/ink" xmlns:am3d="http://schemas.microsoft.com/office/drawing/2017/model3d" xmlns:oel="http://schemas.microsoft.com/office/2019/extlst" xmlns:r="http://schemas.openxmlformats.org/officeDocument/2006/relationships" xmlns:wp14="http://schemas.microsoft.com/office/word/2010/wordprocessingDrawing" xmlns:wp="http://schemas.openxmlformats.org/drawingml/2006/wordprocessingDrawing" xmlns:wpg="http://schemas.microsoft.com/office/word/2010/wordprocessingGroup" xmlns:wpi="http://schemas.microsoft.com/office/word/2010/wordprocessingInk" xmlns:wps="http://schemas.microsoft.com/office/word/2010/wordprocessingShape" xmlns:o="urn:schemas-microsoft-com:office:office" xmlns:v="urn:schemas-microsoft-com:vml" xmlns:w10="urn:schemas-microsoft-com:office:word" xmlns:w="http://schemas.openxmlformats.org/wordprocessingml/2006/main" xmlns:w14="http://schemas.microsoft.com/office/word/2010/wordml" xmlns:w15="http://schemas.microsoft.com/office/word/2012/wordml" xmlns:w16cex="http://schemas.microsoft.com/office/word/2018/wordml/cex" xmlns:w16cid="http://schemas.microsoft.com/office/word/2016/wordml/cid" xmlns:w16="http://schemas.microsoft.com/office/word/2018/wordml" xmlns:w16sdtdh="http://schemas.microsoft.com/office/word/2020/wordml/sdtdatahash" xmlns:w16sdtfl="http://schemas.microsoft.com/office/word/2024/wordml/sdtformatlock" xmlns:w16se="http://schemas.microsoft.com/office/word/2015/wordml/symex" xmlns:w16du="http://schemas.microsoft.com/office/word/2023/wordml/word16du" xmlns:wne="http://schemas.microsoft.com/office/word/2006/wordml" mc:Ignorable="w14 w15 w16se w16cid w16 w16cex w16sdtdh w16sdtfl w16du wp14">
-  <w:p>
-    <w:pPr>
-      <w:pStyle w:val="Header"/>
-    </w:pPr>
   </w:p>
 </w:hdr>
 </file>

</xml_diff>

<commit_message>
add technical skills and updated resume
</commit_message>
<xml_diff>
--- a/public/Chris-Thackrey-Resume.docx
+++ b/public/Chris-Thackrey-Resume.docx
@@ -496,7 +496,23 @@
           <w:sz w:val="20"/>
           <w:szCs w:val="20"/>
         </w:rPr>
-        <w:t xml:space="preserve"> React, Next.js, React Native, Astro, Svelte, Redux, React Hooks, Context API, D3.js, React Three Fiber, React Flow, Tailwind CSS, </w:t>
+        <w:t xml:space="preserve"> React, Next.js, React Native, Astro, Svelte,</w:t>
+      </w:r>
+      <w:r>
+        <w:rPr>
+          <w:color w:val="auto"/>
+          <w:sz w:val="20"/>
+          <w:szCs w:val="20"/>
+        </w:rPr>
+        <w:t xml:space="preserve"> </w:t>
+      </w:r>
+      <w:r>
+        <w:rPr>
+          <w:color w:val="auto"/>
+          <w:sz w:val="20"/>
+          <w:szCs w:val="20"/>
+        </w:rPr>
+        <w:t xml:space="preserve">Redux, React Hooks, Context API, D3.js, React Three Fiber, React Flow, </w:t>
       </w:r>
       <w:proofErr w:type="spellStart"/>
       <w:r>
@@ -505,6 +521,40 @@
           <w:sz w:val="20"/>
           <w:szCs w:val="20"/>
         </w:rPr>
+        <w:t>TailwindCSS</w:t>
+      </w:r>
+      <w:proofErr w:type="spellEnd"/>
+      <w:r>
+        <w:rPr>
+          <w:color w:val="auto"/>
+          <w:sz w:val="20"/>
+          <w:szCs w:val="20"/>
+        </w:rPr>
+        <w:t>,</w:t>
+      </w:r>
+      <w:r>
+        <w:rPr>
+          <w:color w:val="auto"/>
+          <w:sz w:val="20"/>
+          <w:szCs w:val="20"/>
+        </w:rPr>
+        <w:t xml:space="preserve"> Vite,</w:t>
+      </w:r>
+      <w:r>
+        <w:rPr>
+          <w:color w:val="auto"/>
+          <w:sz w:val="20"/>
+          <w:szCs w:val="20"/>
+        </w:rPr>
+        <w:t xml:space="preserve"> </w:t>
+      </w:r>
+      <w:proofErr w:type="spellStart"/>
+      <w:r>
+        <w:rPr>
+          <w:color w:val="auto"/>
+          <w:sz w:val="20"/>
+          <w:szCs w:val="20"/>
+        </w:rPr>
         <w:t>Shadcn</w:t>
       </w:r>
       <w:proofErr w:type="spellEnd"/>
@@ -533,6 +583,14 @@
           <w:szCs w:val="20"/>
         </w:rPr>
         <w:t xml:space="preserve">, Chakra UI, </w:t>
+      </w:r>
+      <w:r>
+        <w:rPr>
+          <w:color w:val="auto"/>
+          <w:sz w:val="20"/>
+          <w:szCs w:val="20"/>
+        </w:rPr>
+        <w:t xml:space="preserve">Vue, </w:t>
       </w:r>
       <w:proofErr w:type="spellStart"/>
       <w:r>
@@ -672,7 +730,49 @@
           <w:sz w:val="20"/>
           <w:szCs w:val="20"/>
         </w:rPr>
-        <w:t xml:space="preserve"> OpenAI API, Anthropic API, GPT-4o, Claude, Amazon Bedrock, Amazon SageMaker, LLM-as-Judge Evaluation, Retrieval-Augmented Generation (RAG), Prompt Engineering, </w:t>
+        <w:t xml:space="preserve"> OpenAI API, Anthropic API, Claude, </w:t>
+      </w:r>
+      <w:proofErr w:type="spellStart"/>
+      <w:r>
+        <w:rPr>
+          <w:color w:val="auto"/>
+          <w:sz w:val="20"/>
+          <w:szCs w:val="20"/>
+        </w:rPr>
+        <w:t>Jev</w:t>
+      </w:r>
+      <w:proofErr w:type="spellEnd"/>
+      <w:r>
+        <w:rPr>
+          <w:color w:val="auto"/>
+          <w:sz w:val="20"/>
+          <w:szCs w:val="20"/>
+        </w:rPr>
+        <w:t xml:space="preserve">, </w:t>
+      </w:r>
+      <w:r>
+        <w:rPr>
+          <w:color w:val="auto"/>
+          <w:sz w:val="20"/>
+          <w:szCs w:val="20"/>
+        </w:rPr>
+        <w:t>Amazon Bedrock, Amazon SageMaker,</w:t>
+      </w:r>
+      <w:r>
+        <w:rPr>
+          <w:color w:val="auto"/>
+          <w:sz w:val="20"/>
+          <w:szCs w:val="20"/>
+        </w:rPr>
+        <w:t xml:space="preserve"> </w:t>
+      </w:r>
+      <w:r>
+        <w:rPr>
+          <w:color w:val="auto"/>
+          <w:sz w:val="20"/>
+          <w:szCs w:val="20"/>
+        </w:rPr>
+        <w:t xml:space="preserve">LLM-as-Judge Evaluation, Retrieval-Augmented Generation (RAG), Prompt Engineering, </w:t>
       </w:r>
       <w:proofErr w:type="spellStart"/>
       <w:r>
@@ -820,7 +920,7 @@
           <w:sz w:val="20"/>
           <w:szCs w:val="20"/>
         </w:rPr>
-        <w:t xml:space="preserve"> AWS EC2, AWS Lambda, Amazon S3, Route53, </w:t>
+        <w:t xml:space="preserve"> AWS EC2, AWS Lambda, Amazon S3, </w:t>
       </w:r>
       <w:proofErr w:type="spellStart"/>
       <w:r>
@@ -1678,6 +1778,17 @@
     </w:p>
     <w:p>
       <w:pPr>
+        <w:spacing w:before="60" w:after="0" w:line="240" w:lineRule="auto"/>
+        <w:jc w:val="both"/>
+        <w:rPr>
+          <w:color w:val="auto"/>
+          <w:sz w:val="20"/>
+          <w:szCs w:val="20"/>
+        </w:rPr>
+      </w:pPr>
+    </w:p>
+    <w:p>
+      <w:pPr>
         <w:shd w:val="clear" w:color="auto" w:fill="E8E8E8" w:themeFill="background2"/>
         <w:tabs>
           <w:tab w:val="left" w:pos="8730"/>
@@ -1701,6 +1812,7 @@
           <w:sz w:val="20"/>
           <w:szCs w:val="20"/>
         </w:rPr>
+        <w:lastRenderedPageBreak/>
         <w:t>SOFTWARE ENGINEER</w:t>
       </w:r>
       <w:r>
@@ -1786,7 +1898,6 @@
           <w:sz w:val="20"/>
           <w:szCs w:val="20"/>
         </w:rPr>
-        <w:lastRenderedPageBreak/>
         <w:t>Black Flag Design</w:t>
       </w:r>
       <w:r>
@@ -2149,7 +2260,7 @@
           <w:sz w:val="20"/>
           <w:szCs w:val="20"/>
         </w:rPr>
-        <w:t>Architected interactive 3D solution-space visualization using React Three Fiber, six-dimensional quality vectors, centroid clustering, and GPT-4o-assisted cluster labeling.</w:t>
+        <w:t>Architected interactive 3D solution-space visualization using React Three Fiber, six-dimensional quality vectors, centroid clustering, and GPT-assisted cluster labeling.</w:t>
       </w:r>
       <w:r>
         <w:rPr>
@@ -2510,7 +2621,25 @@
           <w:sz w:val="20"/>
           <w:szCs w:val="20"/>
         </w:rPr>
-        <w:t>, S3, and Route53 resources for each district.</w:t>
+        <w:t xml:space="preserve">, </w:t>
+      </w:r>
+      <w:r>
+        <w:rPr>
+          <w:color w:val="auto"/>
+          <w:kern w:val="0"/>
+          <w:sz w:val="20"/>
+          <w:szCs w:val="20"/>
+        </w:rPr>
+        <w:t xml:space="preserve">and </w:t>
+      </w:r>
+      <w:r>
+        <w:rPr>
+          <w:color w:val="auto"/>
+          <w:kern w:val="0"/>
+          <w:sz w:val="20"/>
+          <w:szCs w:val="20"/>
+        </w:rPr>
+        <w:t>S3 resources for each district.</w:t>
       </w:r>
       <w:r>
         <w:rPr>
@@ -2541,6 +2670,15 @@
         <w:t>Supabase</w:t>
       </w:r>
       <w:proofErr w:type="spellEnd"/>
+      <w:r>
+        <w:rPr>
+          <w:color w:val="auto"/>
+          <w:kern w:val="0"/>
+          <w:sz w:val="20"/>
+          <w:szCs w:val="20"/>
+        </w:rPr>
+        <w:t>,</w:t>
+      </w:r>
       <w:r>
         <w:rPr>
           <w:color w:val="auto"/>
@@ -3288,7 +3426,7 @@
     </w:p>
     <w:p>
       <w:pPr>
-        <w:spacing w:after="0" w:line="240" w:lineRule="auto"/>
+        <w:spacing w:after="0" w:line="280" w:lineRule="exact"/>
         <w:ind w:left="0" w:firstLine="0"/>
         <w:jc w:val="both"/>
         <w:rPr>
@@ -3326,7 +3464,7 @@
     </w:p>
     <w:p>
       <w:pPr>
-        <w:spacing w:after="0" w:line="240" w:lineRule="auto"/>
+        <w:spacing w:after="0" w:line="280" w:lineRule="exact"/>
         <w:ind w:left="0" w:firstLine="0"/>
         <w:jc w:val="both"/>
         <w:rPr>
@@ -3439,7 +3577,7 @@
     </w:p>
     <w:p>
       <w:pPr>
-        <w:spacing w:after="0" w:line="240" w:lineRule="auto"/>
+        <w:spacing w:after="0" w:line="280" w:lineRule="exact"/>
         <w:ind w:left="0"/>
         <w:jc w:val="both"/>
         <w:rPr>
@@ -3494,7 +3632,7 @@
     </w:p>
     <w:p>
       <w:pPr>
-        <w:spacing w:after="0" w:line="240" w:lineRule="auto"/>
+        <w:spacing w:after="0" w:line="280" w:lineRule="exact"/>
         <w:ind w:left="0"/>
         <w:jc w:val="both"/>
         <w:rPr>
@@ -3788,16 +3926,6 @@
         <w:sz w:val="24"/>
       </w:rPr>
       <w:tab/>
-    </w:r>
-    <w:r>
-      <w:rPr>
-        <w:b/>
-        <w:bCs/>
-        <w:color w:val="000000" w:themeColor="text1"/>
-        <w:sz w:val="24"/>
-      </w:rPr>
-      <w:tab/>
-      <w:t>Page 2</w:t>
     </w:r>
   </w:p>
 </w:hdr>

</xml_diff>